<commit_message>
Ajout CSV original, README complet avec Binder, lien README dans Word
- ETE_435_Donnees_Devoir_1_H26 (1).csv : donnees brutes originales du devoir
- README.md : documentation complete avec badge Binder (execution en ligne),
  guide installation locale, description des fichiers et resultats obtenus
- .gitignore : exclusion venv, caches et fichiers temporaires
- Word : ajout hyperlien vers README.md dans la section Fichiers livrables

Co-Authored-By: Claude Sonnet 4.6 <noreply@anthropic.com>
</commit_message>
<xml_diff>
--- a/Y-Groupe Erudit - Devoir de geo-informatique.docx
+++ b/Y-Groupe Erudit - Devoir de geo-informatique.docx
@@ -5966,6 +5966,48 @@
         <w:spacing w:before="4" w:after="4" w:line="360" w:lineRule="auto"/>
         <w:jc w:val="center"/>
         <w:rPr>
+          <w:rFonts w:ascii="Times New Roman" w:hAnsi="Times New Roman" w:cs="Times New Roman"/>
+          <w:sz w:val="20"/>
+          <w:szCs w:val="20"/>
+        </w:rPr>
+      </w:pPr>
+      <w:r>
+        <w:rPr>
+          <w:rFonts w:ascii="Times New Roman" w:eastAsia="Arial" w:hAnsi="Times New Roman" w:cs="Times New Roman"/>
+          <w:bCs/>
+          <w:sz w:val="20"/>
+          <w:szCs w:val="20"/>
+        </w:rPr>
+        <w:t>Export géospatial</w:t>
+      </w:r>
+      <w:r>
+        <w:rPr>
+          <w:rFonts w:ascii="Times New Roman" w:eastAsia="Arial" w:hAnsi="Times New Roman" w:cs="Times New Roman"/>
+          <w:b/>
+          <w:bCs/>
+          <w:sz w:val="20"/>
+          <w:szCs w:val="20"/>
+        </w:rPr>
+        <w:t xml:space="preserve"> : </w:t>
+      </w:r>
+      <w:hyperlink r:id="rId24" w:history="1">
+        <w:r>
+          <w:rPr>
+            <w:rStyle w:val="Hyperlink"/>
+            <w:rFonts w:ascii="Times New Roman" w:eastAsia="Arial" w:hAnsi="Times New Roman" w:cs="Times New Roman"/>
+            <w:color w:val="1155CC"/>
+            <w:sz w:val="20"/>
+            <w:szCs w:val="20"/>
+          </w:rPr>
+          <w:t>README.md</w:t>
+        </w:r>
+      </w:hyperlink>
+    </w:p>
+    <w:p>
+      <w:pPr>
+        <w:spacing w:before="4" w:after="4" w:line="360" w:lineRule="auto"/>
+        <w:jc w:val="center"/>
+        <w:rPr>
           <w:rStyle w:val="Hyperlink"/>
           <w:rFonts w:ascii="Times New Roman" w:hAnsi="Times New Roman" w:cs="Times New Roman"/>
           <w:color w:val="1155CC"/>

</xml_diff>